<commit_message>
docs: registrar merge del PR #2 y evidencias finales
</commit_message>
<xml_diff>
--- a/docs/Informe_Capitulo_4_OptiFiber.docx
+++ b/docs/Informe_Capitulo_4_OptiFiber.docx
@@ -4465,7 +4465,7 @@
           <w:color w:val="0F172A"/>
           <w:sz w:val="16"/>
         </w:rPr>
-        <w:t>============================= 21 passed in 0.13s ==============================</w:t>
+        <w:t>============================= 21 passed in 0.16s ==============================</w:t>
       </w:r>
     </w:p>
     <w:p>
@@ -4753,7 +4753,16 @@
         <w:spacing w:after="40"/>
       </w:pPr>
       <w:r>
-        <w:t>Merge local: se registra al fusionar la rama.</w:t>
+        <w:t>Merge local: 329b4ea.</w:t>
+      </w:r>
+    </w:p>
+    <w:p>
+      <w:pPr>
+        <w:pStyle w:val="ListBullet"/>
+        <w:spacing w:after="40"/>
+      </w:pPr>
+      <w:r>
+        <w:t>Tag de entrega: pbi-02-v1.0.</w:t>
       </w:r>
     </w:p>
     <w:p>

</xml_diff>

<commit_message>
feat: subir proyecto completo
</commit_message>
<xml_diff>
--- a/docs/Informe_Capitulo_4_OptiFiber.docx
+++ b/docs/Informe_Capitulo_4_OptiFiber.docx
@@ -46,9 +46,9 @@
           <w:color w:val="0F172A"/>
           <w:sz w:val="40"/>
         </w:rPr>
-        <w:t>Persistencia de Datos, Mapeo ORM</w:t>
+        <w:t>Persistencia de Datos, Mapeo ORM,</w:t>
         <w:br/>
-        <w:t>y Pruebas con Fixtures</w:t>
+        <w:t>Pruebas con Fixtures e Interfaz Gráfica</w:t>
       </w:r>
     </w:p>
     <w:tbl>
@@ -245,7 +245,7 @@
               <w:rPr>
                 <w:sz w:val="18"/>
               </w:rPr>
-              <w:t>PBI-02 · Persistencia de clientes, pedidos y catálogo FTTH</w:t>
+              <w:t>PBI-02 · Persistencia de clientes, pedidos y catálogo FTTH + PBI-03 · Interfaz gráfica de escritorio</w:t>
             </w:r>
           </w:p>
         </w:tc>
@@ -277,7 +277,7 @@
               <w:rPr>
                 <w:sz w:val="18"/>
               </w:rPr>
-              <w:t>feature/PBI-02-orm-persistencia</w:t>
+              <w:t>feature/PBI-02-orm-persistencia y feature/PBI-03-interfaz-grafica</w:t>
             </w:r>
           </w:p>
         </w:tc>
@@ -309,7 +309,7 @@
               <w:rPr>
                 <w:sz w:val="18"/>
               </w:rPr>
-              <w:t>Python 3.12+ · SQLAlchemy 2.x · SQLite · pytest · Ruff · GitHub Actions</w:t>
+              <w:t>Python 3.12+ · SQLAlchemy 2.x · SQLite · CustomTkinter · pytest · Ruff · GitHub Actions</w:t>
             </w:r>
           </w:p>
         </w:tc>
@@ -655,7 +655,12 @@
     </w:p>
     <w:p>
       <w:r>
-        <w:t>La solución se desarrolló con ciclos TDD RED → GREEN → REFACTOR y un fixture de base de datos en memoria (sqlite:///:memory:) que garantiza pruebas herméticas. La suite final tiene 21 pruebas aprobadas, Ruff no reporta errores y el workflow de GitHub Actions instala SQLAlchemy, ejecuta Ruff y pytest. La CLI permite demostrar el flujo completo: catálogo, alta de clientes, pedido con descuento de stock, reporte y eliminación en cascada.</w:t>
+        <w:t>La solución se desarrolló con ciclos TDD RED → GREEN → REFACTOR y un fixture de base de datos en memoria (sqlite:///:memory:) que garantiza pruebas herméticas. La suite final tiene 23 pruebas aprobadas, Ruff no reporta errores y el workflow de GitHub Actions instala SQLAlchemy, ejecuta Ruff y pytest. La CLI permite demostrar el flujo completo: catálogo, alta de clientes, pedido con descuento de stock, reporte y eliminación en cascada.</w:t>
+      </w:r>
+    </w:p>
+    <w:p>
+      <w:r>
+        <w:t>Sobre esa base, el PBI-03 incorpora una aplicación de escritorio con CustomTkinter: panel general, catálogo, clientes, pedidos y reportes; tema oscuro minimalista, formularios modales, punto de venta con carrito, exportación CSV y pedidos de demostración idempotentes. La interfaz reutiliza los repositorios y las reglas de negocio, por lo que no duplica la lógica.</w:t>
       </w:r>
     </w:p>
     <w:tbl>
@@ -803,7 +808,7 @@
               <w:rPr>
                 <w:sz w:val="18"/>
               </w:rPr>
-              <w:t>21 passed</w:t>
+              <w:t>23 passed (21 del PBI-02 + 2 de datos demo)</w:t>
             </w:r>
           </w:p>
         </w:tc>
@@ -836,6 +841,38 @@
                 <w:sz w:val="18"/>
               </w:rPr>
               <w:t>Ruff: All checks passed!</w:t>
+            </w:r>
+          </w:p>
+        </w:tc>
+      </w:tr>
+      <w:tr>
+        <w:tc>
+          <w:tcPr>
+            <w:tcW w:type="dxa" w:w="2736"/>
+            <w:shd w:val="clear" w:color="auto" w:fill="EFF6FF"/>
+          </w:tcPr>
+          <w:p>
+            <w:r/>
+            <w:r>
+              <w:rPr>
+                <w:b/>
+                <w:sz w:val="18"/>
+              </w:rPr>
+              <w:t>Interfaz</w:t>
+            </w:r>
+          </w:p>
+        </w:tc>
+        <w:tc>
+          <w:tcPr>
+            <w:tcW w:type="dxa" w:w="6480"/>
+          </w:tcPr>
+          <w:p>
+            <w:r/>
+            <w:r>
+              <w:rPr>
+                <w:sz w:val="18"/>
+              </w:rPr>
+              <w:t>GUI CustomTkinter con 5 pantallas, tema oscuro y exportación CSV</w:t>
             </w:r>
           </w:p>
         </w:tc>
@@ -911,13 +948,9 @@
       </w:pPr>
     </w:p>
     <w:p>
-      <w:r>
-        <w:br w:type="page"/>
-      </w:r>
-    </w:p>
-    <w:p>
       <w:pPr>
         <w:pStyle w:val="Heading1"/>
+        <w:pageBreakBefore/>
       </w:pPr>
       <w:r>
         <w:t>4.1 Modelo Entidad-Relación (ERD)</w:t>
@@ -933,45 +966,75 @@
     </w:p>
     <w:p>
       <w:pPr>
-        <w:pStyle w:val="ListNumber"/>
         <w:spacing w:after="40"/>
+        <w:ind w:left="340" w:hanging="227"/>
       </w:pPr>
+      <w:r>
+        <w:rPr>
+          <w:b/>
+        </w:rPr>
+        <w:t xml:space="preserve">1. </w:t>
+      </w:r>
       <w:r>
         <w:t>Identificar de forma única a cada cliente por DNI o RUC.</w:t>
       </w:r>
     </w:p>
     <w:p>
       <w:pPr>
-        <w:pStyle w:val="ListNumber"/>
         <w:spacing w:after="40"/>
+        <w:ind w:left="340" w:hanging="227"/>
       </w:pPr>
+      <w:r>
+        <w:rPr>
+          <w:b/>
+        </w:rPr>
+        <w:t xml:space="preserve">2. </w:t>
+      </w:r>
       <w:r>
         <w:t>Clasificar productos FTTH por categoría y etiquetas comerciales.</w:t>
       </w:r>
     </w:p>
     <w:p>
       <w:pPr>
-        <w:pStyle w:val="ListNumber"/>
         <w:spacing w:after="40"/>
+        <w:ind w:left="340" w:hanging="227"/>
       </w:pPr>
+      <w:r>
+        <w:rPr>
+          <w:b/>
+        </w:rPr>
+        <w:t xml:space="preserve">3. </w:t>
+      </w:r>
       <w:r>
         <w:t>Registrar pedidos con varias líneas, conservando el precio unitario histórico.</w:t>
       </w:r>
     </w:p>
     <w:p>
       <w:pPr>
-        <w:pStyle w:val="ListNumber"/>
         <w:spacing w:after="40"/>
+        <w:ind w:left="340" w:hanging="227"/>
       </w:pPr>
+      <w:r>
+        <w:rPr>
+          <w:b/>
+        </w:rPr>
+        <w:t xml:space="preserve">4. </w:t>
+      </w:r>
       <w:r>
         <w:t>Controlar el stock y calcular totales con descuento por volumen.</w:t>
       </w:r>
     </w:p>
     <w:p>
       <w:pPr>
-        <w:pStyle w:val="ListNumber"/>
         <w:spacing w:after="40"/>
+        <w:ind w:left="340" w:hanging="227"/>
       </w:pPr>
+      <w:r>
+        <w:rPr>
+          <w:b/>
+        </w:rPr>
+        <w:t xml:space="preserve">5. </w:t>
+      </w:r>
       <w:r>
         <w:t>Eliminar un cliente junto con sus pedidos y detalles sin dejar registros huérfanos.</w:t>
       </w:r>
@@ -4341,6 +4404,52 @@
                 <w:b/>
                 <w:sz w:val="17"/>
               </w:rPr>
+              <w:t>tests/test_seed.py</w:t>
+            </w:r>
+          </w:p>
+        </w:tc>
+        <w:tc>
+          <w:tcPr>
+            <w:tcW w:type="dxa" w:w="1008"/>
+          </w:tcPr>
+          <w:p>
+            <w:r/>
+            <w:r>
+              <w:rPr>
+                <w:sz w:val="17"/>
+              </w:rPr>
+              <w:t>2</w:t>
+            </w:r>
+          </w:p>
+        </w:tc>
+        <w:tc>
+          <w:tcPr>
+            <w:tcW w:type="dxa" w:w="5040"/>
+          </w:tcPr>
+          <w:p>
+            <w:r/>
+            <w:r>
+              <w:rPr>
+                <w:sz w:val="17"/>
+              </w:rPr>
+              <w:t>Catálogo inicial y pedidos demo idempotentes con descuento de stock.</w:t>
+            </w:r>
+          </w:p>
+        </w:tc>
+      </w:tr>
+      <w:tr>
+        <w:tc>
+          <w:tcPr>
+            <w:tcW w:type="dxa" w:w="3168"/>
+            <w:shd w:val="clear" w:color="auto" w:fill="EFF6FF"/>
+          </w:tcPr>
+          <w:p>
+            <w:r/>
+            <w:r>
+              <w:rPr>
+                <w:b/>
+                <w:sz w:val="17"/>
+              </w:rPr>
               <w:t>Total</w:t>
             </w:r>
           </w:p>
@@ -4355,7 +4464,7 @@
               <w:rPr>
                 <w:sz w:val="17"/>
               </w:rPr>
-              <w:t>21</w:t>
+              <w:t>23</w:t>
             </w:r>
           </w:p>
         </w:tc>
@@ -4420,7 +4529,7 @@
           <w:color w:val="0F172A"/>
           <w:sz w:val="16"/>
         </w:rPr>
-        <w:t>tests/test_repositorios.py::test_crear_pedido_aplica_descuento_por_volumen PASSED [ 80%]</w:t>
+        <w:t>tests/test_repositorios.py::test_cliente_rechaza_documento_duplicado PASSED [ 82%]</w:t>
         <w:br/>
       </w:r>
       <w:r>
@@ -4429,7 +4538,7 @@
           <w:color w:val="0F172A"/>
           <w:sz w:val="16"/>
         </w:rPr>
-        <w:t>tests/test_repositorios.py::test_crear_pedido_rechaza_stock_insuficiente PASSED [ 85%]</w:t>
+        <w:t>tests/test_repositorios.py::test_eliminar_cliente_aplica_cascada_a_pedidos PASSED [ 86%]</w:t>
         <w:br/>
       </w:r>
       <w:r>
@@ -4438,7 +4547,7 @@
           <w:color w:val="0F172A"/>
           <w:sz w:val="16"/>
         </w:rPr>
-        <w:t>tests/test_repositorios.py::test_cliente_rechaza_documento_duplicado PASSED [ 90%]</w:t>
+        <w:t>tests/test_repositorios.py::test_catalogo_lista_productos_con_categoria_y_etiquetas PASSED [ 91%]</w:t>
         <w:br/>
       </w:r>
       <w:r>
@@ -4447,7 +4556,7 @@
           <w:color w:val="0F172A"/>
           <w:sz w:val="16"/>
         </w:rPr>
-        <w:t>tests/test_repositorios.py::test_eliminar_cliente_aplica_cascada_a_pedidos PASSED [ 95%]</w:t>
+        <w:t>tests/test_seed.py::test_sembrar_datos_carga_catalogo_y_clientes PASSED  [ 95%]</w:t>
         <w:br/>
       </w:r>
       <w:r>
@@ -4456,7 +4565,7 @@
           <w:color w:val="0F172A"/>
           <w:sz w:val="16"/>
         </w:rPr>
-        <w:t>tests/test_repositorios.py::test_catalogo_lista_productos_con_categoria_y_etiquetas PASSED [100%]</w:t>
+        <w:t>tests/test_seed.py::test_sembrar_pedidos_demo_es_idempotente_y_descuenta_stock PASSED [100%]</w:t>
         <w:br/>
       </w:r>
       <w:r>
@@ -4465,7 +4574,7 @@
           <w:color w:val="0F172A"/>
           <w:sz w:val="16"/>
         </w:rPr>
-        <w:t>============================= 21 passed in 0.16s ==============================</w:t>
+        <w:t>============================= 23 passed in 0.18s ==============================</w:t>
       </w:r>
     </w:p>
     <w:p>
@@ -4486,7 +4595,7 @@
           <w:color w:val="0F172A"/>
           <w:sz w:val="16"/>
         </w:rPr>
-        <w:t>﻿All checks passed!</w:t>
+        <w:t>All checks passed!</w:t>
       </w:r>
     </w:p>
     <w:p>
@@ -4691,7 +4800,7 @@
     </w:p>
     <w:p>
       <w:r>
-        <w:t>requirements.txt declara SQLAlchemy&gt;=2.0,&lt;3.0; por eso el pipeline instala el ORM antes de ejecutar las pruebas.</w:t>
+        <w:t>requirements.txt declara SQLAlchemy&gt;=2.0,&lt;3.0, customtkinter&gt;=5.2,&lt;7.0 y pillow&gt;=10.0,&lt;14.0; por eso el pipeline instala el ORM y la interfaz gráfica antes de ejecutar las pruebas.</w:t>
       </w:r>
     </w:p>
     <w:p>
@@ -4766,79 +4875,968 @@
       </w:r>
     </w:p>
     <w:p>
+      <w:pPr>
+        <w:pStyle w:val="ListBullet"/>
+        <w:spacing w:after="40"/>
+      </w:pPr>
       <w:r>
-        <w:br w:type="page"/>
+        <w:t>PBI-03: rama feature/PBI-03-interfaz-grafica, merge --no-ff a main y tag pbi-03-gui-v1.0.</w:t>
       </w:r>
     </w:p>
     <w:p>
       <w:pPr>
         <w:pStyle w:val="Heading1"/>
+        <w:pageBreakBefore/>
       </w:pPr>
       <w:r>
-        <w:t>4.4 Conclusiones</w:t>
+        <w:t>4.4 Interfaz gráfica de escritorio</w:t>
       </w:r>
     </w:p>
     <w:p>
       <w:pPr>
-        <w:pStyle w:val="ListNumber"/>
+        <w:pStyle w:val="Heading2"/>
+      </w:pPr>
+      <w:r>
+        <w:t>4.4.1 Objetivo y decisiones de diseño</w:t>
+      </w:r>
+    </w:p>
+    <w:p>
+      <w:r>
+        <w:t>El PBI-02 dejó una capa de persistencia sólida, pero su uso diario dependía de la terminal. El PBI-03 añade una aplicación de escritorio funcional para que el asesor comercial opere el sistema con mouse y teclado. Se eligió CustomTkinter por ser una extensión moderna de Tkinter, ligera, multiplataforma y fácil de instalar.</w:t>
+      </w:r>
+    </w:p>
+    <w:p>
+      <w:pPr>
+        <w:pStyle w:val="ListBullet"/>
         <w:spacing w:after="40"/>
       </w:pPr>
+      <w:r>
+        <w:t>Tema oscuro minimalista: fondo #070B10, paneles #0E151E, texto #F4F7FB y acento turquesa #2DD4BF.</w:t>
+      </w:r>
+    </w:p>
+    <w:p>
+      <w:pPr>
+        <w:pStyle w:val="ListBullet"/>
+        <w:spacing w:after="40"/>
+      </w:pPr>
+      <w:r>
+        <w:t>Pocas imágenes: la identidad visual se resuelve con tipografía, tarjetas, píldoras de estado y un icono propio.</w:t>
+      </w:r>
+    </w:p>
+    <w:p>
+      <w:pPr>
+        <w:pStyle w:val="ListBullet"/>
+        <w:spacing w:after="40"/>
+      </w:pPr>
+      <w:r>
+        <w:t>Reutilización de capas: la GUI llama a los repositorios; las reglas de totales, descuento, stock y documento siguen en src/dominio.</w:t>
+      </w:r>
+    </w:p>
+    <w:p>
+      <w:pPr>
+        <w:pStyle w:val="ListBullet"/>
+        <w:spacing w:after="40"/>
+      </w:pPr>
+      <w:r>
+        <w:t>Terminal conservada: python -m src.main --cli y --demo mantienen el flujo anterior.</w:t>
+      </w:r>
+    </w:p>
+    <w:p>
+      <w:pPr>
+        <w:pStyle w:val="ListBullet"/>
+        <w:spacing w:after="40"/>
+      </w:pPr>
+      <w:r>
+        <w:t>Primer arranque útil: sembrar_pedidos_demo() crea pedidos de ejemplo de forma idempotente por cliente, estado y líneas.</w:t>
+      </w:r>
+    </w:p>
+    <w:p>
+      <w:pPr>
+        <w:pStyle w:val="Heading2"/>
+      </w:pPr>
+      <w:r>
+        <w:t>4.4.2 Pantallas implementadas</w:t>
+      </w:r>
+    </w:p>
+    <w:tbl>
+      <w:tblPr>
+        <w:tblStyle w:val="TableGrid"/>
+        <w:tblW w:type="auto" w:w="0"/>
+        <w:jc w:val="center"/>
+        <w:tblLayout w:type="fixed"/>
+        <w:tblLook w:firstColumn="1" w:firstRow="1" w:lastColumn="0" w:lastRow="0" w:noHBand="0" w:noVBand="1" w:val="04A0"/>
+      </w:tblPr>
+      <w:tblGrid>
+        <w:gridCol w:w="3137"/>
+        <w:gridCol w:w="3137"/>
+        <w:gridCol w:w="3137"/>
+      </w:tblGrid>
+      <w:tr>
+        <w:tc>
+          <w:tcPr>
+            <w:tcW w:type="dxa" w:w="1728"/>
+            <w:shd w:val="clear" w:color="auto" w:fill="1D4ED8"/>
+          </w:tcPr>
+          <w:p>
+            <w:pPr>
+              <w:jc w:val="center"/>
+            </w:pPr>
+            <w:r/>
+            <w:r>
+              <w:rPr>
+                <w:b/>
+                <w:color w:val="FFFFFF"/>
+                <w:sz w:val="17"/>
+              </w:rPr>
+              <w:t>Pantalla</w:t>
+            </w:r>
+          </w:p>
+        </w:tc>
+        <w:tc>
+          <w:tcPr>
+            <w:tcW w:type="dxa" w:w="4176"/>
+            <w:shd w:val="clear" w:color="auto" w:fill="1D4ED8"/>
+          </w:tcPr>
+          <w:p>
+            <w:pPr>
+              <w:jc w:val="center"/>
+            </w:pPr>
+            <w:r/>
+            <w:r>
+              <w:rPr>
+                <w:b/>
+                <w:color w:val="FFFFFF"/>
+                <w:sz w:val="17"/>
+              </w:rPr>
+              <w:t>Componentes principales</w:t>
+            </w:r>
+          </w:p>
+        </w:tc>
+        <w:tc>
+          <w:tcPr>
+            <w:tcW w:type="dxa" w:w="3600"/>
+            <w:shd w:val="clear" w:color="auto" w:fill="1D4ED8"/>
+          </w:tcPr>
+          <w:p>
+            <w:pPr>
+              <w:jc w:val="center"/>
+            </w:pPr>
+            <w:r/>
+            <w:r>
+              <w:rPr>
+                <w:b/>
+                <w:color w:val="FFFFFF"/>
+                <w:sz w:val="17"/>
+              </w:rPr>
+              <w:t>Operaciones</w:t>
+            </w:r>
+          </w:p>
+        </w:tc>
+      </w:tr>
+      <w:tr>
+        <w:tc>
+          <w:tcPr>
+            <w:tcW w:type="dxa" w:w="1728"/>
+            <w:shd w:val="clear" w:color="auto" w:fill="EFF6FF"/>
+          </w:tcPr>
+          <w:p>
+            <w:r/>
+            <w:r>
+              <w:rPr>
+                <w:b/>
+                <w:sz w:val="17"/>
+              </w:rPr>
+              <w:t>Panel general</w:t>
+            </w:r>
+          </w:p>
+        </w:tc>
+        <w:tc>
+          <w:tcPr>
+            <w:tcW w:type="dxa" w:w="4176"/>
+          </w:tcPr>
+          <w:p>
+            <w:r/>
+            <w:r>
+              <w:rPr>
+                <w:sz w:val="17"/>
+              </w:rPr>
+              <w:t>Cuatro KPI, pedidos recientes, alerta de stock bajo</w:t>
+            </w:r>
+          </w:p>
+        </w:tc>
+        <w:tc>
+          <w:tcPr>
+            <w:tcW w:type="dxa" w:w="3600"/>
+          </w:tcPr>
+          <w:p>
+            <w:r/>
+            <w:r>
+              <w:rPr>
+                <w:sz w:val="17"/>
+              </w:rPr>
+              <w:t>Consultar el negocio y navegar</w:t>
+            </w:r>
+          </w:p>
+        </w:tc>
+      </w:tr>
+      <w:tr>
+        <w:tc>
+          <w:tcPr>
+            <w:tcW w:type="dxa" w:w="1728"/>
+            <w:shd w:val="clear" w:color="auto" w:fill="EFF6FF"/>
+          </w:tcPr>
+          <w:p>
+            <w:r/>
+            <w:r>
+              <w:rPr>
+                <w:b/>
+                <w:sz w:val="17"/>
+              </w:rPr>
+              <w:t>Catálogo</w:t>
+            </w:r>
+          </w:p>
+        </w:tc>
+        <w:tc>
+          <w:tcPr>
+            <w:tcW w:type="dxa" w:w="4176"/>
+          </w:tcPr>
+          <w:p>
+            <w:r/>
+            <w:r>
+              <w:rPr>
+                <w:sz w:val="17"/>
+              </w:rPr>
+              <w:t>Búsqueda, filtro, tabla, modales de producto y categoría</w:t>
+            </w:r>
+          </w:p>
+        </w:tc>
+        <w:tc>
+          <w:tcPr>
+            <w:tcW w:type="dxa" w:w="3600"/>
+          </w:tcPr>
+          <w:p>
+            <w:r/>
+            <w:r>
+              <w:rPr>
+                <w:sz w:val="17"/>
+              </w:rPr>
+              <w:t>Crear categorías y productos con etiquetas</w:t>
+            </w:r>
+          </w:p>
+        </w:tc>
+      </w:tr>
+      <w:tr>
+        <w:tc>
+          <w:tcPr>
+            <w:tcW w:type="dxa" w:w="1728"/>
+            <w:shd w:val="clear" w:color="auto" w:fill="EFF6FF"/>
+          </w:tcPr>
+          <w:p>
+            <w:r/>
+            <w:r>
+              <w:rPr>
+                <w:b/>
+                <w:sz w:val="17"/>
+              </w:rPr>
+              <w:t>Clientes</w:t>
+            </w:r>
+          </w:p>
+        </w:tc>
+        <w:tc>
+          <w:tcPr>
+            <w:tcW w:type="dxa" w:w="4176"/>
+          </w:tcPr>
+          <w:p>
+            <w:r/>
+            <w:r>
+              <w:rPr>
+                <w:sz w:val="17"/>
+              </w:rPr>
+              <w:t>Buscador, directorio, ficha con historial</w:t>
+            </w:r>
+          </w:p>
+        </w:tc>
+        <w:tc>
+          <w:tcPr>
+            <w:tcW w:type="dxa" w:w="3600"/>
+          </w:tcPr>
+          <w:p>
+            <w:r/>
+            <w:r>
+              <w:rPr>
+                <w:sz w:val="17"/>
+              </w:rPr>
+              <w:t>Crear, consultar y eliminar con cascada</w:t>
+            </w:r>
+          </w:p>
+        </w:tc>
+      </w:tr>
+      <w:tr>
+        <w:tc>
+          <w:tcPr>
+            <w:tcW w:type="dxa" w:w="1728"/>
+            <w:shd w:val="clear" w:color="auto" w:fill="EFF6FF"/>
+          </w:tcPr>
+          <w:p>
+            <w:r/>
+            <w:r>
+              <w:rPr>
+                <w:b/>
+                <w:sz w:val="17"/>
+              </w:rPr>
+              <w:t>Pedidos</w:t>
+            </w:r>
+          </w:p>
+        </w:tc>
+        <w:tc>
+          <w:tcPr>
+            <w:tcW w:type="dxa" w:w="4176"/>
+          </w:tcPr>
+          <w:p>
+            <w:r/>
+            <w:r>
+              <w:rPr>
+                <w:sz w:val="17"/>
+              </w:rPr>
+              <w:t>Selector de cliente, catálogo, carrito, resumen de totales</w:t>
+            </w:r>
+          </w:p>
+        </w:tc>
+        <w:tc>
+          <w:tcPr>
+            <w:tcW w:type="dxa" w:w="3600"/>
+          </w:tcPr>
+          <w:p>
+            <w:r/>
+            <w:r>
+              <w:rPr>
+                <w:sz w:val="17"/>
+              </w:rPr>
+              <w:t>Armar pedidos, validar stock, confirmar y cambiar estado</w:t>
+            </w:r>
+          </w:p>
+        </w:tc>
+      </w:tr>
+      <w:tr>
+        <w:tc>
+          <w:tcPr>
+            <w:tcW w:type="dxa" w:w="1728"/>
+            <w:shd w:val="clear" w:color="auto" w:fill="EFF6FF"/>
+          </w:tcPr>
+          <w:p>
+            <w:r/>
+            <w:r>
+              <w:rPr>
+                <w:b/>
+                <w:sz w:val="17"/>
+              </w:rPr>
+              <w:t>Reportes</w:t>
+            </w:r>
+          </w:p>
+        </w:tc>
+        <w:tc>
+          <w:tcPr>
+            <w:tcW w:type="dxa" w:w="4176"/>
+          </w:tcPr>
+          <w:p>
+            <w:r/>
+            <w:r>
+              <w:rPr>
+                <w:sz w:val="17"/>
+              </w:rPr>
+              <w:t>KPIs, ventas por estado, top de productos, inventario</w:t>
+            </w:r>
+          </w:p>
+        </w:tc>
+        <w:tc>
+          <w:tcPr>
+            <w:tcW w:type="dxa" w:w="3600"/>
+          </w:tcPr>
+          <w:p>
+            <w:r/>
+            <w:r>
+              <w:rPr>
+                <w:sz w:val="17"/>
+              </w:rPr>
+              <w:t>Analizar ventas y exportar CSV</w:t>
+            </w:r>
+          </w:p>
+        </w:tc>
+      </w:tr>
+    </w:tbl>
+    <w:p>
+      <w:pPr>
+        <w:spacing w:after="20"/>
+      </w:pPr>
+    </w:p>
+    <w:p>
+      <w:pPr>
+        <w:pStyle w:val="Caption"/>
+        <w:jc w:val="center"/>
+      </w:pPr>
+      <w:r>
+        <w:rPr>
+          <w:i/>
+          <w:color w:val="64748B"/>
+          <w:sz w:val="17"/>
+        </w:rPr>
+        <w:t>Tabla 6. Pantallas de la aplicación de escritorio.</w:t>
+      </w:r>
+    </w:p>
+    <w:p>
+      <w:r>
+        <w:t>La navegación lateral resalta la pantalla activa y la barra superior muestra el título, la fecha y un botón de refresco. Los atajos Ctrl+1 … Ctrl+5 cambian de pantalla y F5 recarga la vista actual.</w:t>
+      </w:r>
+    </w:p>
+    <w:p>
+      <w:pPr>
+        <w:pStyle w:val="Heading2"/>
+      </w:pPr>
+      <w:r>
+        <w:t>4.4.3 Evidencias de la interfaz</w:t>
+      </w:r>
+    </w:p>
+    <w:p>
+      <w:pPr>
+        <w:spacing w:before="80" w:after="40"/>
+        <w:jc w:val="center"/>
+      </w:pPr>
+      <w:r>
+        <w:drawing>
+          <wp:inline xmlns:a="http://schemas.openxmlformats.org/drawingml/2006/main" xmlns:pic="http://schemas.openxmlformats.org/drawingml/2006/picture">
+            <wp:extent cx="5832000" cy="3687882"/>
+            <wp:docPr id="2" name="Picture 2"/>
+            <wp:cNvGraphicFramePr>
+              <a:graphicFrameLocks noChangeAspect="1"/>
+            </wp:cNvGraphicFramePr>
+            <a:graphic>
+              <a:graphicData uri="http://schemas.openxmlformats.org/drawingml/2006/picture">
+                <pic:pic>
+                  <pic:nvPicPr>
+                    <pic:cNvPr id="0" name="01_panel_general.png"/>
+                    <pic:cNvPicPr/>
+                  </pic:nvPicPr>
+                  <pic:blipFill>
+                    <a:blip r:embed="rId12"/>
+                    <a:stretch>
+                      <a:fillRect/>
+                    </a:stretch>
+                  </pic:blipFill>
+                  <pic:spPr>
+                    <a:xfrm>
+                      <a:off x="0" y="0"/>
+                      <a:ext cx="5832000" cy="3687882"/>
+                    </a:xfrm>
+                    <a:prstGeom prst="rect"/>
+                  </pic:spPr>
+                </pic:pic>
+              </a:graphicData>
+            </a:graphic>
+          </wp:inline>
+        </w:drawing>
+      </w:r>
+    </w:p>
+    <w:p>
+      <w:pPr>
+        <w:pStyle w:val="Caption"/>
+        <w:jc w:val="center"/>
+      </w:pPr>
+      <w:r>
+        <w:rPr>
+          <w:i/>
+          <w:color w:val="64748B"/>
+          <w:sz w:val="17"/>
+        </w:rPr>
+        <w:t>Figura G1. Panel general con indicadores, pedidos recientes y alertas de stock.</w:t>
+      </w:r>
+    </w:p>
+    <w:p>
+      <w:pPr>
+        <w:spacing w:before="80" w:after="40"/>
+        <w:jc w:val="center"/>
+      </w:pPr>
+      <w:r>
+        <w:drawing>
+          <wp:inline xmlns:a="http://schemas.openxmlformats.org/drawingml/2006/main" xmlns:pic="http://schemas.openxmlformats.org/drawingml/2006/picture">
+            <wp:extent cx="5832000" cy="3687882"/>
+            <wp:docPr id="3" name="Picture 3"/>
+            <wp:cNvGraphicFramePr>
+              <a:graphicFrameLocks noChangeAspect="1"/>
+            </wp:cNvGraphicFramePr>
+            <a:graphic>
+              <a:graphicData uri="http://schemas.openxmlformats.org/drawingml/2006/picture">
+                <pic:pic>
+                  <pic:nvPicPr>
+                    <pic:cNvPr id="0" name="04_pedidos.png"/>
+                    <pic:cNvPicPr/>
+                  </pic:nvPicPr>
+                  <pic:blipFill>
+                    <a:blip r:embed="rId13"/>
+                    <a:stretch>
+                      <a:fillRect/>
+                    </a:stretch>
+                  </pic:blipFill>
+                  <pic:spPr>
+                    <a:xfrm>
+                      <a:off x="0" y="0"/>
+                      <a:ext cx="5832000" cy="3687882"/>
+                    </a:xfrm>
+                    <a:prstGeom prst="rect"/>
+                  </pic:spPr>
+                </pic:pic>
+              </a:graphicData>
+            </a:graphic>
+          </wp:inline>
+        </w:drawing>
+      </w:r>
+    </w:p>
+    <w:p>
+      <w:pPr>
+        <w:pStyle w:val="Caption"/>
+        <w:jc w:val="center"/>
+      </w:pPr>
+      <w:r>
+        <w:rPr>
+          <w:i/>
+          <w:color w:val="64748B"/>
+          <w:sz w:val="17"/>
+        </w:rPr>
+        <w:t>Figura G2. Punto de venta con cliente, catálogo, carrito y resumen de totales.</w:t>
+      </w:r>
+    </w:p>
+    <w:p>
+      <w:pPr>
+        <w:spacing w:before="80" w:after="40"/>
+        <w:jc w:val="center"/>
+      </w:pPr>
+      <w:r>
+        <w:drawing>
+          <wp:inline xmlns:a="http://schemas.openxmlformats.org/drawingml/2006/main" xmlns:pic="http://schemas.openxmlformats.org/drawingml/2006/picture">
+            <wp:extent cx="5832000" cy="3687882"/>
+            <wp:docPr id="4" name="Picture 4"/>
+            <wp:cNvGraphicFramePr>
+              <a:graphicFrameLocks noChangeAspect="1"/>
+            </wp:cNvGraphicFramePr>
+            <a:graphic>
+              <a:graphicData uri="http://schemas.openxmlformats.org/drawingml/2006/picture">
+                <pic:pic>
+                  <pic:nvPicPr>
+                    <pic:cNvPr id="0" name="05_reportes.png"/>
+                    <pic:cNvPicPr/>
+                  </pic:nvPicPr>
+                  <pic:blipFill>
+                    <a:blip r:embed="rId14"/>
+                    <a:stretch>
+                      <a:fillRect/>
+                    </a:stretch>
+                  </pic:blipFill>
+                  <pic:spPr>
+                    <a:xfrm>
+                      <a:off x="0" y="0"/>
+                      <a:ext cx="5832000" cy="3687882"/>
+                    </a:xfrm>
+                    <a:prstGeom prst="rect"/>
+                  </pic:spPr>
+                </pic:pic>
+              </a:graphicData>
+            </a:graphic>
+          </wp:inline>
+        </w:drawing>
+      </w:r>
+    </w:p>
+    <w:p>
+      <w:pPr>
+        <w:pStyle w:val="Caption"/>
+        <w:jc w:val="center"/>
+      </w:pPr>
+      <w:r>
+        <w:rPr>
+          <w:i/>
+          <w:color w:val="64748B"/>
+          <w:sz w:val="17"/>
+        </w:rPr>
+        <w:t>Figura G3. Reportes con ventas por estado, ranking de productos e inventario.</w:t>
+      </w:r>
+    </w:p>
+    <w:p>
+      <w:r>
+        <w:t>Las capturas restantes (catálogo, clientes, modal de producto, detalle de pedido y ficha de cliente) están disponibles en docs/evidencias/gui/.</w:t>
+      </w:r>
+    </w:p>
+    <w:p>
+      <w:pPr>
+        <w:pStyle w:val="Heading2"/>
+      </w:pPr>
+      <w:r>
+        <w:t>4.4.4 Flujo funcional validado</w:t>
+      </w:r>
+    </w:p>
+    <w:p>
+      <w:r>
+        <w:t>Además de las pruebas automatizadas, se ejecutó una prueba de humo sobre la GUI real con una base temporal:</w:t>
+      </w:r>
+    </w:p>
+    <w:p>
+      <w:pPr>
+        <w:spacing w:after="40"/>
+        <w:ind w:left="340" w:hanging="227"/>
+      </w:pPr>
+      <w:r>
+        <w:rPr>
+          <w:b/>
+        </w:rPr>
+        <w:t xml:space="preserve">1. </w:t>
+      </w:r>
+      <w:r>
+        <w:t>Alta de una categoría y de un producto TST-001 con precio, stock y etiquetas desde los modales.</w:t>
+      </w:r>
+    </w:p>
+    <w:p>
+      <w:pPr>
+        <w:spacing w:after="40"/>
+        <w:ind w:left="340" w:hanging="227"/>
+      </w:pPr>
+      <w:r>
+        <w:rPr>
+          <w:b/>
+        </w:rPr>
+        <w:t xml:space="preserve">2. </w:t>
+      </w:r>
+      <w:r>
+        <w:t>Alta de un cliente con documento válido desde la pantalla Clientes.</w:t>
+      </w:r>
+    </w:p>
+    <w:p>
+      <w:pPr>
+        <w:spacing w:after="40"/>
+        <w:ind w:left="340" w:hanging="227"/>
+      </w:pPr>
+      <w:r>
+        <w:rPr>
+          <w:b/>
+        </w:rPr>
+        <w:t xml:space="preserve">3. </w:t>
+      </w:r>
+      <w:r>
+        <w:t>Selección del cliente, dos unidades en el carrito y confirmación del pedido.</w:t>
+      </w:r>
+    </w:p>
+    <w:p>
+      <w:pPr>
+        <w:spacing w:after="40"/>
+        <w:ind w:left="340" w:hanging="227"/>
+      </w:pPr>
+      <w:r>
+        <w:rPr>
+          <w:b/>
+        </w:rPr>
+        <w:t xml:space="preserve">4. </w:t>
+      </w:r>
+      <w:r>
+        <w:t>Verificación del total (S/ 199.80) y del descuento de stock.</w:t>
+      </w:r>
+    </w:p>
+    <w:p>
+      <w:pPr>
+        <w:spacing w:after="40"/>
+        <w:ind w:left="340" w:hanging="227"/>
+      </w:pPr>
+      <w:r>
+        <w:rPr>
+          <w:b/>
+        </w:rPr>
+        <w:t xml:space="preserve">5. </w:t>
+      </w:r>
+      <w:r>
+        <w:t>Cambio del pedido a estado PAGADO desde el modal de detalle.</w:t>
+      </w:r>
+    </w:p>
+    <w:p>
+      <w:pPr>
+        <w:spacing w:after="40"/>
+        <w:ind w:left="340" w:hanging="227"/>
+      </w:pPr>
+      <w:r>
+        <w:rPr>
+          <w:b/>
+        </w:rPr>
+        <w:t xml:space="preserve">6. </w:t>
+      </w:r>
+      <w:r>
+        <w:t>Exportación del reporte a CSV en la carpeta reportes/.</w:t>
+      </w:r>
+    </w:p>
+    <w:p>
+      <w:r>
+        <w:t>El flujo terminó sin errores y confirmó que la interfaz escribe en SQLite a través de los mismos repositorios del PBI-02.</w:t>
+      </w:r>
+    </w:p>
+    <w:p>
+      <w:pPr>
+        <w:pStyle w:val="Heading2"/>
+      </w:pPr>
+      <w:r>
+        <w:t>4.4.5 Estructura y resultado</w:t>
+      </w:r>
+    </w:p>
+    <w:p>
+      <w:pPr>
+        <w:pStyle w:val="Codigo"/>
+        <w:shd w:val="clear" w:color="auto" w:fill="F1F5F9"/>
+        <w:pBdr>
+          <w:top w:val="single" w:sz="6" w:space="4" w:color="E2E8F0"/>
+          <w:left w:val="single" w:sz="6" w:space="4" w:color="E2E8F0"/>
+          <w:bottom w:val="single" w:sz="6" w:space="4" w:color="E2E8F0"/>
+          <w:right w:val="single" w:sz="6" w:space="4" w:color="E2E8F0"/>
+        </w:pBdr>
+        <w:spacing w:after="120" w:before="40" w:line="240" w:lineRule="auto"/>
+      </w:pPr>
+      <w:r>
+        <w:rPr>
+          <w:rFonts w:ascii="Consolas" w:hAnsi="Consolas"/>
+          <w:color w:val="0F172A"/>
+          <w:sz w:val="16"/>
+        </w:rPr>
+        <w:t>src/presentacion/gui/</w:t>
+        <w:br/>
+      </w:r>
+      <w:r>
+        <w:rPr>
+          <w:rFonts w:ascii="Consolas" w:hAnsi="Consolas"/>
+          <w:color w:val="0F172A"/>
+          <w:sz w:val="16"/>
+        </w:rPr>
+        <w:t>├── app.py            # Ventana principal, barra lateral, barra superior y routing</w:t>
+        <w:br/>
+      </w:r>
+      <w:r>
+        <w:rPr>
+          <w:rFonts w:ascii="Consolas" w:hAnsi="Consolas"/>
+          <w:color w:val="0F172A"/>
+          <w:sz w:val="16"/>
+        </w:rPr>
+        <w:t>├── tema.py           # Paleta, tipografías y radios</w:t>
+        <w:br/>
+      </w:r>
+      <w:r>
+        <w:rPr>
+          <w:rFonts w:ascii="Consolas" w:hAnsi="Consolas"/>
+          <w:color w:val="0F172A"/>
+          <w:sz w:val="16"/>
+        </w:rPr>
+        <w:t>├── componentes.py    # Tarjetas, tablas, botones, campos, modales y toasts</w:t>
+        <w:br/>
+      </w:r>
+      <w:r>
+        <w:rPr>
+          <w:rFonts w:ascii="Consolas" w:hAnsi="Consolas"/>
+          <w:color w:val="0F172A"/>
+          <w:sz w:val="16"/>
+        </w:rPr>
+        <w:t>├── utilidades.py     # Moneda, fechas, iniciales y colores semánticos</w:t>
+        <w:br/>
+      </w:r>
+      <w:r>
+        <w:rPr>
+          <w:rFonts w:ascii="Consolas" w:hAnsi="Consolas"/>
+          <w:color w:val="0F172A"/>
+          <w:sz w:val="16"/>
+        </w:rPr>
+        <w:t>└── pantallas/</w:t>
+        <w:br/>
+      </w:r>
+      <w:r>
+        <w:rPr>
+          <w:rFonts w:ascii="Consolas" w:hAnsi="Consolas"/>
+          <w:color w:val="0F172A"/>
+          <w:sz w:val="16"/>
+        </w:rPr>
+        <w:t xml:space="preserve">    ├── dashboard.py</w:t>
+        <w:br/>
+      </w:r>
+      <w:r>
+        <w:rPr>
+          <w:rFonts w:ascii="Consolas" w:hAnsi="Consolas"/>
+          <w:color w:val="0F172A"/>
+          <w:sz w:val="16"/>
+        </w:rPr>
+        <w:t xml:space="preserve">    ├── catalogo.py</w:t>
+        <w:br/>
+      </w:r>
+      <w:r>
+        <w:rPr>
+          <w:rFonts w:ascii="Consolas" w:hAnsi="Consolas"/>
+          <w:color w:val="0F172A"/>
+          <w:sz w:val="16"/>
+        </w:rPr>
+        <w:t xml:space="preserve">    ├── clientes.py</w:t>
+        <w:br/>
+      </w:r>
+      <w:r>
+        <w:rPr>
+          <w:rFonts w:ascii="Consolas" w:hAnsi="Consolas"/>
+          <w:color w:val="0F172A"/>
+          <w:sz w:val="16"/>
+        </w:rPr>
+        <w:t xml:space="preserve">    ├── pedidos.py</w:t>
+        <w:br/>
+      </w:r>
+      <w:r>
+        <w:rPr>
+          <w:rFonts w:ascii="Consolas" w:hAnsi="Consolas"/>
+          <w:color w:val="0F172A"/>
+          <w:sz w:val="16"/>
+        </w:rPr>
+        <w:t xml:space="preserve">    └── reportes.py</w:t>
+      </w:r>
+    </w:p>
+    <w:p>
+      <w:r>
+        <w:t>La ventana principal crea una única sesión SQLAlchemy, inicializa el esquema, siembra los datos y comparte los repositorios con todas las pantallas. Al cerrar, cierra la sesión y libera el engine. La aplicación se abre con python -m src.main; la suite total queda en 23 pruebas aprobadas y Ruff no reporta errores.</w:t>
+      </w:r>
+    </w:p>
+    <w:p>
+      <w:pPr>
+        <w:pStyle w:val="Heading1"/>
+        <w:pageBreakBefore/>
+      </w:pPr>
+      <w:r>
+        <w:t>4.5 Conclusiones</w:t>
+      </w:r>
+    </w:p>
+    <w:p>
+      <w:pPr>
+        <w:spacing w:after="40"/>
+        <w:ind w:left="340" w:hanging="227"/>
+      </w:pPr>
+      <w:r>
+        <w:rPr>
+          <w:b/>
+        </w:rPr>
+        <w:t xml:space="preserve">1. </w:t>
+      </w:r>
       <w:r>
         <w:t>El ERD refleja el negocio real: cliente, pedido, detalle, producto, categoría y etiqueta cubren el flujo comercial de OPTIFIBER sin tablas innecesarias.</w:t>
       </w:r>
     </w:p>
     <w:p>
       <w:pPr>
-        <w:pStyle w:val="ListNumber"/>
         <w:spacing w:after="40"/>
+        <w:ind w:left="340" w:hanging="227"/>
       </w:pPr>
+      <w:r>
+        <w:rPr>
+          <w:b/>
+        </w:rPr>
+        <w:t xml:space="preserve">2. </w:t>
+      </w:r>
       <w:r>
         <w:t>La separación de capas funcionó: las reglas de negocio se probaron sin base de datos y los modelos ORM se probaron con SQLite en memoria.</w:t>
       </w:r>
     </w:p>
     <w:p>
       <w:pPr>
-        <w:pStyle w:val="ListNumber"/>
         <w:spacing w:after="40"/>
+        <w:ind w:left="340" w:hanging="227"/>
       </w:pPr>
+      <w:r>
+        <w:rPr>
+          <w:b/>
+        </w:rPr>
+        <w:t xml:space="preserve">3. </w:t>
+      </w:r>
       <w:r>
         <w:t>La cascada es segura y explícita: eliminar un cliente elimina sus pedidos y detalles; categorías y productos se protegen con RESTRICT.</w:t>
       </w:r>
     </w:p>
     <w:p>
       <w:pPr>
-        <w:pStyle w:val="ListNumber"/>
         <w:spacing w:after="40"/>
+        <w:ind w:left="340" w:hanging="227"/>
       </w:pPr>
+      <w:r>
+        <w:rPr>
+          <w:b/>
+        </w:rPr>
+        <w:t xml:space="preserve">4. </w:t>
+      </w:r>
       <w:r>
         <w:t>El fixture hermético evita efectos colaterales: cada prueba recibe una base nueva y no depende de data/optifiber.db.</w:t>
       </w:r>
     </w:p>
     <w:p>
       <w:pPr>
-        <w:pStyle w:val="ListNumber"/>
         <w:spacing w:after="40"/>
+        <w:ind w:left="340" w:hanging="227"/>
       </w:pPr>
+      <w:r>
+        <w:rPr>
+          <w:b/>
+        </w:rPr>
+        <w:t xml:space="preserve">5. </w:t>
+      </w:r>
       <w:r>
         <w:t>El TDD dejó evidencia verificable: cada ciclo tiene un commit RED que falla por la razón esperada y un commit GREEN que lo resuelve.</w:t>
       </w:r>
     </w:p>
     <w:p>
       <w:pPr>
-        <w:pStyle w:val="ListNumber"/>
         <w:spacing w:after="40"/>
+        <w:ind w:left="340" w:hanging="227"/>
       </w:pPr>
+      <w:r>
+        <w:rPr>
+          <w:b/>
+        </w:rPr>
+        <w:t xml:space="preserve">6. </w:t>
+      </w:r>
       <w:r>
         <w:t>La solución es funcional: la CLI permite registrar clientes y pedidos, consultar el historial, ver reportes y comprobar la cascada.</w:t>
       </w:r>
     </w:p>
     <w:p>
       <w:pPr>
-        <w:pStyle w:val="ListNumber"/>
         <w:spacing w:after="40"/>
+        <w:ind w:left="340" w:hanging="227"/>
       </w:pPr>
       <w:r>
+        <w:rPr>
+          <w:b/>
+        </w:rPr>
+        <w:t xml:space="preserve">7. </w:t>
+      </w:r>
+      <w:r>
         <w:t>La calidad está automatizada: Ruff y pytest se ejecutan localmente y en GitHub Actions; el pipeline falla si alguna prueba o regla de estilo se rompe.</w:t>
+      </w:r>
+    </w:p>
+    <w:p>
+      <w:pPr>
+        <w:spacing w:after="40"/>
+        <w:ind w:left="340" w:hanging="227"/>
+      </w:pPr>
+      <w:r>
+        <w:rPr>
+          <w:b/>
+        </w:rPr>
+        <w:t xml:space="preserve">8. </w:t>
+      </w:r>
+      <w:r>
+        <w:t>La GUI reutiliza la arquitectura: las pantallas llaman a los repositorios existentes y las reglas de negocio permanecen en src/dominio, sin duplicar lógica.</w:t>
+      </w:r>
+    </w:p>
+    <w:p>
+      <w:pPr>
+        <w:spacing w:after="40"/>
+        <w:ind w:left="340" w:hanging="227"/>
+      </w:pPr>
+      <w:r>
+        <w:rPr>
+          <w:b/>
+        </w:rPr>
+        <w:t xml:space="preserve">9. </w:t>
+      </w:r>
+      <w:r>
+        <w:t>La experiencia de escritorio quedó completa: panel, catálogo, clientes, pedidos, reportes, formularios modales y exportación CSV cubren el flujo comercial sin terminal.</w:t>
       </w:r>
     </w:p>
     <w:p>
@@ -4899,7 +5897,7 @@
         <w:pStyle w:val="Heading1"/>
       </w:pPr>
       <w:r>
-        <w:t>4.5 Lista de verificación para el docente</w:t>
+        <w:t>4.6 Lista de verificación para el docente</w:t>
       </w:r>
     </w:p>
     <w:tbl>
@@ -4939,7 +5937,7 @@
         </w:tc>
         <w:tc>
           <w:tcPr>
-            <w:tcW w:type="dxa" w:w="3312"/>
+            <w:tcW w:type="dxa" w:w="3456"/>
             <w:shd w:val="clear" w:color="auto" w:fill="1D4ED8"/>
           </w:tcPr>
           <w:p>
@@ -4959,7 +5957,7 @@
         </w:tc>
         <w:tc>
           <w:tcPr>
-            <w:tcW w:type="dxa" w:w="4320"/>
+            <w:tcW w:type="dxa" w:w="4176"/>
             <w:shd w:val="clear" w:color="auto" w:fill="1D4ED8"/>
           </w:tcPr>
           <w:p>
@@ -5017,7 +6015,7 @@
         </w:tc>
         <w:tc>
           <w:tcPr>
-            <w:tcW w:type="dxa" w:w="3312"/>
+            <w:tcW w:type="dxa" w:w="3456"/>
           </w:tcPr>
           <w:p>
             <w:r/>
@@ -5031,7 +6029,7 @@
         </w:tc>
         <w:tc>
           <w:tcPr>
-            <w:tcW w:type="dxa" w:w="4320"/>
+            <w:tcW w:type="dxa" w:w="4176"/>
           </w:tcPr>
           <w:p>
             <w:r/>
@@ -5053,7 +6051,7 @@
               <w:rPr>
                 <w:sz w:val="17"/>
               </w:rPr>
-              <w:t>CUMPLIDO</w:t>
+              <w:t>SÍ</w:t>
             </w:r>
           </w:p>
         </w:tc>
@@ -5077,7 +6075,7 @@
         </w:tc>
         <w:tc>
           <w:tcPr>
-            <w:tcW w:type="dxa" w:w="3312"/>
+            <w:tcW w:type="dxa" w:w="3456"/>
           </w:tcPr>
           <w:p>
             <w:r/>
@@ -5091,7 +6089,7 @@
         </w:tc>
         <w:tc>
           <w:tcPr>
-            <w:tcW w:type="dxa" w:w="4320"/>
+            <w:tcW w:type="dxa" w:w="4176"/>
           </w:tcPr>
           <w:p>
             <w:r/>
@@ -5113,7 +6111,7 @@
               <w:rPr>
                 <w:sz w:val="17"/>
               </w:rPr>
-              <w:t>CUMPLIDO</w:t>
+              <w:t>SÍ</w:t>
             </w:r>
           </w:p>
         </w:tc>
@@ -5137,7 +6135,7 @@
         </w:tc>
         <w:tc>
           <w:tcPr>
-            <w:tcW w:type="dxa" w:w="3312"/>
+            <w:tcW w:type="dxa" w:w="3456"/>
           </w:tcPr>
           <w:p>
             <w:r/>
@@ -5151,7 +6149,7 @@
         </w:tc>
         <w:tc>
           <w:tcPr>
-            <w:tcW w:type="dxa" w:w="4320"/>
+            <w:tcW w:type="dxa" w:w="4176"/>
           </w:tcPr>
           <w:p>
             <w:r/>
@@ -5159,7 +6157,7 @@
               <w:rPr>
                 <w:sz w:val="17"/>
               </w:rPr>
-              <w:t>21 passed; §4.3.2 y §4.3.4</w:t>
+              <w:t>23 passed; §4.3.2 y §4.3.4</w:t>
             </w:r>
           </w:p>
         </w:tc>
@@ -5173,7 +6171,7 @@
               <w:rPr>
                 <w:sz w:val="17"/>
               </w:rPr>
-              <w:t>CUMPLIDO</w:t>
+              <w:t>SÍ</w:t>
             </w:r>
           </w:p>
         </w:tc>
@@ -5197,7 +6195,7 @@
         </w:tc>
         <w:tc>
           <w:tcPr>
-            <w:tcW w:type="dxa" w:w="3312"/>
+            <w:tcW w:type="dxa" w:w="3456"/>
           </w:tcPr>
           <w:p>
             <w:r/>
@@ -5211,7 +6209,7 @@
         </w:tc>
         <w:tc>
           <w:tcPr>
-            <w:tcW w:type="dxa" w:w="4320"/>
+            <w:tcW w:type="dxa" w:w="4176"/>
           </w:tcPr>
           <w:p>
             <w:r/>
@@ -5233,7 +6231,7 @@
               <w:rPr>
                 <w:sz w:val="17"/>
               </w:rPr>
-              <w:t>CUMPLIDO</w:t>
+              <w:t>SÍ</w:t>
             </w:r>
           </w:p>
         </w:tc>
@@ -5257,7 +6255,7 @@
         </w:tc>
         <w:tc>
           <w:tcPr>
-            <w:tcW w:type="dxa" w:w="3312"/>
+            <w:tcW w:type="dxa" w:w="3456"/>
           </w:tcPr>
           <w:p>
             <w:r/>
@@ -5271,7 +6269,7 @@
         </w:tc>
         <w:tc>
           <w:tcPr>
-            <w:tcW w:type="dxa" w:w="4320"/>
+            <w:tcW w:type="dxa" w:w="4176"/>
           </w:tcPr>
           <w:p>
             <w:r/>
@@ -5293,7 +6291,7 @@
               <w:rPr>
                 <w:sz w:val="17"/>
               </w:rPr>
-              <w:t>CUMPLIDO</w:t>
+              <w:t>SÍ</w:t>
             </w:r>
           </w:p>
         </w:tc>
@@ -5317,7 +6315,7 @@
         </w:tc>
         <w:tc>
           <w:tcPr>
-            <w:tcW w:type="dxa" w:w="3312"/>
+            <w:tcW w:type="dxa" w:w="3456"/>
           </w:tcPr>
           <w:p>
             <w:r/>
@@ -5331,7 +6329,7 @@
         </w:tc>
         <w:tc>
           <w:tcPr>
-            <w:tcW w:type="dxa" w:w="4320"/>
+            <w:tcW w:type="dxa" w:w="4176"/>
           </w:tcPr>
           <w:p>
             <w:r/>
@@ -5353,7 +6351,67 @@
               <w:rPr>
                 <w:sz w:val="17"/>
               </w:rPr>
-              <w:t>CUMPLIDO</w:t>
+              <w:t>SÍ</w:t>
+            </w:r>
+          </w:p>
+        </w:tc>
+      </w:tr>
+      <w:tr>
+        <w:tc>
+          <w:tcPr>
+            <w:tcW w:type="dxa" w:w="720"/>
+            <w:shd w:val="clear" w:color="auto" w:fill="EFF6FF"/>
+          </w:tcPr>
+          <w:p>
+            <w:r/>
+            <w:r>
+              <w:rPr>
+                <w:b/>
+                <w:sz w:val="17"/>
+              </w:rPr>
+              <w:t>7</w:t>
+            </w:r>
+          </w:p>
+        </w:tc>
+        <w:tc>
+          <w:tcPr>
+            <w:tcW w:type="dxa" w:w="3456"/>
+          </w:tcPr>
+          <w:p>
+            <w:r/>
+            <w:r>
+              <w:rPr>
+                <w:sz w:val="17"/>
+              </w:rPr>
+              <w:t>Aplicación funcional con interfaz gráfica</w:t>
+            </w:r>
+          </w:p>
+        </w:tc>
+        <w:tc>
+          <w:tcPr>
+            <w:tcW w:type="dxa" w:w="4176"/>
+          </w:tcPr>
+          <w:p>
+            <w:r/>
+            <w:r>
+              <w:rPr>
+                <w:sz w:val="17"/>
+              </w:rPr>
+              <w:t>§4.4, src/presentacion/gui/ y docs/evidencias/gui/</w:t>
+            </w:r>
+          </w:p>
+        </w:tc>
+        <w:tc>
+          <w:tcPr>
+            <w:tcW w:type="dxa" w:w="864"/>
+          </w:tcPr>
+          <w:p>
+            <w:r/>
+            <w:r>
+              <w:rPr>
+                <w:sz w:val="17"/>
+              </w:rPr>
+              <w:t>SÍ</w:t>
             </w:r>
           </w:p>
         </w:tc>
@@ -5375,7 +6433,7 @@
           <w:color w:val="64748B"/>
           <w:sz w:val="17"/>
         </w:rPr>
-        <w:t>Tabla 6. Checklist oficial del Trabajo Colaborativo N° 04.</w:t>
+        <w:t>Tabla 7. Checklist oficial del Trabajo Colaborativo N° 04.</w:t>
       </w:r>
     </w:p>
     <w:p>
@@ -5595,7 +6653,7 @@
               <w:rPr>
                 <w:sz w:val="17"/>
               </w:rPr>
-              <w:t>21 aprobadas</w:t>
+              <w:t>21 aprobadas al cierre del PBI-02</w:t>
             </w:r>
           </w:p>
         </w:tc>
@@ -5730,7 +6788,7 @@
               <w:rPr>
                 <w:sz w:val="17"/>
               </w:rPr>
-              <w:t>Repositorio, PBI, revisión, merge, informe.</w:t>
+              <w:t>Repositorio, PBI, revisión, merges, tags e informe.</w:t>
             </w:r>
           </w:p>
         </w:tc>
@@ -5868,7 +6926,267 @@
               <w:rPr>
                 <w:sz w:val="17"/>
               </w:rPr>
-              <w:t>Fixture, pruebas, Ruff, CI, CLI y evidencias.</w:t>
+              <w:t>Fixture, pruebas, Ruff, CI, GUI CustomTkinter y evidencias.</w:t>
+            </w:r>
+          </w:p>
+        </w:tc>
+      </w:tr>
+    </w:tbl>
+    <w:p>
+      <w:pPr>
+        <w:spacing w:after="20"/>
+      </w:pPr>
+    </w:p>
+    <w:p>
+      <w:pPr>
+        <w:pStyle w:val="Heading2"/>
+      </w:pPr>
+      <w:r>
+        <w:t>Anexo C · PBI-03</w:t>
+      </w:r>
+    </w:p>
+    <w:tbl>
+      <w:tblPr>
+        <w:tblStyle w:val="TableGrid"/>
+        <w:tblW w:type="auto" w:w="0"/>
+        <w:jc w:val="center"/>
+        <w:tblLayout w:type="fixed"/>
+        <w:tblLook w:firstColumn="1" w:firstRow="1" w:lastColumn="0" w:lastRow="0" w:noHBand="0" w:noVBand="1" w:val="04A0"/>
+      </w:tblPr>
+      <w:tblGrid>
+        <w:gridCol w:w="4706"/>
+        <w:gridCol w:w="4706"/>
+      </w:tblGrid>
+      <w:tr>
+        <w:tc>
+          <w:tcPr>
+            <w:tcW w:type="dxa" w:w="1584"/>
+            <w:shd w:val="clear" w:color="auto" w:fill="1D4ED8"/>
+          </w:tcPr>
+          <w:p>
+            <w:pPr>
+              <w:jc w:val="center"/>
+            </w:pPr>
+            <w:r/>
+            <w:r>
+              <w:rPr>
+                <w:b/>
+                <w:color w:val="FFFFFF"/>
+                <w:sz w:val="17"/>
+              </w:rPr>
+              <w:t>Campo</w:t>
+            </w:r>
+          </w:p>
+        </w:tc>
+        <w:tc>
+          <w:tcPr>
+            <w:tcW w:type="dxa" w:w="7632"/>
+            <w:shd w:val="clear" w:color="auto" w:fill="1D4ED8"/>
+          </w:tcPr>
+          <w:p>
+            <w:pPr>
+              <w:jc w:val="center"/>
+            </w:pPr>
+            <w:r/>
+            <w:r>
+              <w:rPr>
+                <w:b/>
+                <w:color w:val="FFFFFF"/>
+                <w:sz w:val="17"/>
+              </w:rPr>
+              <w:t>Valor</w:t>
+            </w:r>
+          </w:p>
+        </w:tc>
+      </w:tr>
+      <w:tr>
+        <w:tc>
+          <w:tcPr>
+            <w:tcW w:type="dxa" w:w="1584"/>
+            <w:shd w:val="clear" w:color="auto" w:fill="EFF6FF"/>
+          </w:tcPr>
+          <w:p>
+            <w:r/>
+            <w:r>
+              <w:rPr>
+                <w:b/>
+                <w:sz w:val="17"/>
+              </w:rPr>
+              <w:t>Historia</w:t>
+            </w:r>
+          </w:p>
+        </w:tc>
+        <w:tc>
+          <w:tcPr>
+            <w:tcW w:type="dxa" w:w="7632"/>
+          </w:tcPr>
+          <w:p>
+            <w:r/>
+            <w:r>
+              <w:rPr>
+                <w:sz w:val="17"/>
+              </w:rPr>
+              <w:t>Como asesor comercial de OPTIFIBER deseo gestionar clientes, productos, pedidos y reportes desde una aplicación de escritorio para operar sin depender de la terminal.</w:t>
+            </w:r>
+          </w:p>
+        </w:tc>
+      </w:tr>
+      <w:tr>
+        <w:tc>
+          <w:tcPr>
+            <w:tcW w:type="dxa" w:w="1584"/>
+            <w:shd w:val="clear" w:color="auto" w:fill="EFF6FF"/>
+          </w:tcPr>
+          <w:p>
+            <w:r/>
+            <w:r>
+              <w:rPr>
+                <w:b/>
+                <w:sz w:val="17"/>
+              </w:rPr>
+              <w:t>Criterios</w:t>
+            </w:r>
+          </w:p>
+        </w:tc>
+        <w:tc>
+          <w:tcPr>
+            <w:tcW w:type="dxa" w:w="7632"/>
+          </w:tcPr>
+          <w:p>
+            <w:r/>
+            <w:r>
+              <w:rPr>
+                <w:sz w:val="17"/>
+              </w:rPr>
+              <w:t>Abrir la GUI por defecto; navegar entre cinco pantallas; crear productos y clientes; registrar pedidos con stock; cambiar estados; eliminar clientes en cascada; exportar reportes.</w:t>
+            </w:r>
+          </w:p>
+        </w:tc>
+      </w:tr>
+      <w:tr>
+        <w:tc>
+          <w:tcPr>
+            <w:tcW w:type="dxa" w:w="1584"/>
+            <w:shd w:val="clear" w:color="auto" w:fill="EFF6FF"/>
+          </w:tcPr>
+          <w:p>
+            <w:r/>
+            <w:r>
+              <w:rPr>
+                <w:b/>
+                <w:sz w:val="17"/>
+              </w:rPr>
+              <w:t>Rama</w:t>
+            </w:r>
+          </w:p>
+        </w:tc>
+        <w:tc>
+          <w:tcPr>
+            <w:tcW w:type="dxa" w:w="7632"/>
+          </w:tcPr>
+          <w:p>
+            <w:r/>
+            <w:r>
+              <w:rPr>
+                <w:sz w:val="17"/>
+              </w:rPr>
+              <w:t>feature/PBI-03-interfaz-grafica</w:t>
+            </w:r>
+          </w:p>
+        </w:tc>
+      </w:tr>
+      <w:tr>
+        <w:tc>
+          <w:tcPr>
+            <w:tcW w:type="dxa" w:w="1584"/>
+            <w:shd w:val="clear" w:color="auto" w:fill="EFF6FF"/>
+          </w:tcPr>
+          <w:p>
+            <w:r/>
+            <w:r>
+              <w:rPr>
+                <w:b/>
+                <w:sz w:val="17"/>
+              </w:rPr>
+              <w:t>Estado</w:t>
+            </w:r>
+          </w:p>
+        </w:tc>
+        <w:tc>
+          <w:tcPr>
+            <w:tcW w:type="dxa" w:w="7632"/>
+          </w:tcPr>
+          <w:p>
+            <w:r/>
+            <w:r>
+              <w:rPr>
+                <w:sz w:val="17"/>
+              </w:rPr>
+              <w:t>Terminado · fusionado a main</w:t>
+            </w:r>
+          </w:p>
+        </w:tc>
+      </w:tr>
+      <w:tr>
+        <w:tc>
+          <w:tcPr>
+            <w:tcW w:type="dxa" w:w="1584"/>
+            <w:shd w:val="clear" w:color="auto" w:fill="EFF6FF"/>
+          </w:tcPr>
+          <w:p>
+            <w:r/>
+            <w:r>
+              <w:rPr>
+                <w:b/>
+                <w:sz w:val="17"/>
+              </w:rPr>
+              <w:t>Pruebas</w:t>
+            </w:r>
+          </w:p>
+        </w:tc>
+        <w:tc>
+          <w:tcPr>
+            <w:tcW w:type="dxa" w:w="7632"/>
+          </w:tcPr>
+          <w:p>
+            <w:r/>
+            <w:r>
+              <w:rPr>
+                <w:sz w:val="17"/>
+              </w:rPr>
+              <w:t>23 aprobadas en total (21 del PBI-02 + 2 de datos demo)</w:t>
+            </w:r>
+          </w:p>
+        </w:tc>
+      </w:tr>
+      <w:tr>
+        <w:tc>
+          <w:tcPr>
+            <w:tcW w:type="dxa" w:w="1584"/>
+            <w:shd w:val="clear" w:color="auto" w:fill="EFF6FF"/>
+          </w:tcPr>
+          <w:p>
+            <w:r/>
+            <w:r>
+              <w:rPr>
+                <w:b/>
+                <w:sz w:val="17"/>
+              </w:rPr>
+              <w:t>Evidencias</w:t>
+            </w:r>
+          </w:p>
+        </w:tc>
+        <w:tc>
+          <w:tcPr>
+            <w:tcW w:type="dxa" w:w="7632"/>
+          </w:tcPr>
+          <w:p>
+            <w:r/>
+            <w:r>
+              <w:rPr>
+                <w:sz w:val="17"/>
+              </w:rPr>
+              <w:t>docs/evidencias/gui/</w:t>
             </w:r>
           </w:p>
         </w:tc>
@@ -5894,6 +7212,15 @@
       </w:pPr>
       <w:r>
         <w:t>SQLAlchemy Documentation. ORM Declarative Mapping y Relationship Configuration. https://docs.sqlalchemy.org/</w:t>
+      </w:r>
+    </w:p>
+    <w:p>
+      <w:pPr>
+        <w:pStyle w:val="ListBullet"/>
+        <w:spacing w:after="40"/>
+      </w:pPr>
+      <w:r>
+        <w:t>CustomTkinter Documentation. Modern UI toolkit for Tkinter. https://customtkinter.tomschimansky.com/</w:t>
       </w:r>
     </w:p>
     <w:p>
@@ -6006,7 +7333,7 @@
         <w:color w:val="475569"/>
         <w:sz w:val="16"/>
       </w:rPr>
-      <w:t>PBI-02 · Capítulo 4</w:t>
+      <w:t>PBI-02 + PBI-03 · Capítulo 4</w:t>
     </w:r>
   </w:p>
 </w:hdr>

</xml_diff>